<commit_message>
vault backup: 2026-07-10 02:09:46
</commit_message>
<xml_diff>
--- a/Investigare/png notevoli/Scheda_PNG_01_Taniguchi_Osamu.docx
+++ b/Investigare/png notevoli/Scheda_PNG_01_Taniguchi_Osamu.docx
@@ -1011,22 +1011,6 @@
     </w:p>
     <w:p>
       <w:pPr>
-        <w:spacing w:after="40"/>
-        <w:ind w:left="170"/>
-      </w:pPr>
-      <w:r>
-        <w:rPr>
-          <w:rFonts w:ascii="Calibri" w:hAnsi="Calibri"/>
-          <w:b w:val="0"/>
-          <w:i/>
-          <w:color w:val="787878"/>
-          <w:sz w:val="16"/>
-        </w:rPr>
-        <w:t>I PNG notevoli non hanno Gou — il Gou è il dono dei protagonisti. Hanno mestiere.</w:t>
-      </w:r>
-    </w:p>
-    <w:p>
-      <w:pPr>
         <w:spacing w:before="100" w:after="20"/>
         <w:ind w:left="170"/>
       </w:pPr>
@@ -1100,7 +1084,7 @@
           <w:color w:val="1A1A2E"/>
           <w:sz w:val="20"/>
         </w:rPr>
-        <w:t>Stampa e media 2 — Esperto</w:t>
+        <w:t>Stampa e media 3 — Maestro</w:t>
       </w:r>
       <w:r>
         <w:rPr>
@@ -1126,7 +1110,7 @@
           <w:color w:val="1A1A2E"/>
           <w:sz w:val="16"/>
         </w:rPr>
-        <w:t>Sa cosa fa notizia, cosa può aspettare, e come si tiene un giornale al guinzaglio per 48 ore. +2 ai tiri pertinenti.</w:t>
+        <w:t>Sa cosa fa notizia, cosa può aspettare, e come si tiene un giornale al guinzaglio per 48 ore. Al grado Maestro (Conoscenza): +3 ai tiri pertinenti.</w:t>
       </w:r>
     </w:p>
     <w:p>

</xml_diff>